<commit_message>
feat: add CRUD functionality for problem types, professors, and technicians
- Implemented the problem types registration page with form validation and listing.
- Created the professors management page with options for adding, editing, and listing professors.
- Developed the technicians management page with similar functionalities for adding, editing, and listing technicians.
- Included CSRF protection and user feedback for form submissions.
</commit_message>
<xml_diff>
--- a/Documentacao/Projeto_Integrador_TADS.docx
+++ b/Documentacao/Projeto_Integrador_TADS.docx
@@ -2084,6 +2084,9 @@
       <w:r>
         <w:t>Cadastro de laboratórios</w:t>
       </w:r>
+      <w:r>
+        <w:t xml:space="preserve"> </w:t>
+      </w:r>
     </w:p>
     <w:p>
       <w:pPr>
@@ -2100,6 +2103,12 @@
       <w:r>
         <w:t>Cadastro de equipamentos</w:t>
       </w:r>
+      <w:r>
+        <w:rPr>
+          <w:noProof/>
+        </w:rPr>
+        <w:t xml:space="preserve"> </w:t>
+      </w:r>
     </w:p>
     <w:p>
       <w:pPr>
@@ -2277,6 +2286,11 @@
     </w:p>
     <w:p>
       <w:pPr>
+        <w:jc w:val="both"/>
+      </w:pPr>
+    </w:p>
+    <w:p>
+      <w:pPr>
         <w:numPr>
           <w:ilvl w:val="0"/>
           <w:numId w:val="3"/>
@@ -2293,6 +2307,102 @@
     </w:p>
     <w:p>
       <w:pPr>
+        <w:ind w:left="1276"/>
+        <w:jc w:val="both"/>
+      </w:pPr>
+      <w:r>
+        <w:drawing>
+          <wp:inline distT="0" distB="0" distL="0" distR="0" wp14:anchorId="3965EC29" wp14:editId="55077600">
+            <wp:extent cx="2850995" cy="3240000"/>
+            <wp:effectExtent l="0" t="0" r="6985" b="0"/>
+            <wp:docPr id="972323314" name="Imagem 1"/>
+            <wp:cNvGraphicFramePr>
+              <a:graphicFrameLocks xmlns:a="http://schemas.openxmlformats.org/drawingml/2006/main" noChangeAspect="1"/>
+            </wp:cNvGraphicFramePr>
+            <a:graphic xmlns:a="http://schemas.openxmlformats.org/drawingml/2006/main">
+              <a:graphicData uri="http://schemas.openxmlformats.org/drawingml/2006/picture">
+                <pic:pic xmlns:pic="http://schemas.openxmlformats.org/drawingml/2006/picture">
+                  <pic:nvPicPr>
+                    <pic:cNvPr id="972323314" name=""/>
+                    <pic:cNvPicPr/>
+                  </pic:nvPicPr>
+                  <pic:blipFill>
+                    <a:blip r:embed="rId9"/>
+                    <a:stretch>
+                      <a:fillRect/>
+                    </a:stretch>
+                  </pic:blipFill>
+                  <pic:spPr>
+                    <a:xfrm>
+                      <a:off x="0" y="0"/>
+                      <a:ext cx="2850995" cy="3240000"/>
+                    </a:xfrm>
+                    <a:prstGeom prst="rect">
+                      <a:avLst/>
+                    </a:prstGeom>
+                  </pic:spPr>
+                </pic:pic>
+              </a:graphicData>
+            </a:graphic>
+          </wp:inline>
+        </w:drawing>
+      </w:r>
+    </w:p>
+    <w:p>
+      <w:pPr>
+        <w:numPr>
+          <w:ilvl w:val="0"/>
+          <w:numId w:val="3"/>
+        </w:numPr>
+        <w:tabs>
+          <w:tab w:val="clear" w:pos="720"/>
+        </w:tabs>
+        <w:ind w:left="1276"/>
+      </w:pPr>
+      <w:r>
+        <w:lastRenderedPageBreak/>
+        <w:t>Tela de cadastro de laboratórios</w:t>
+      </w:r>
+      <w:r>
+        <w:drawing>
+          <wp:inline distT="0" distB="0" distL="0" distR="0" wp14:anchorId="483FE6E9" wp14:editId="25A0C63F">
+            <wp:extent cx="4638046" cy="3240000"/>
+            <wp:effectExtent l="0" t="0" r="0" b="0"/>
+            <wp:docPr id="1807642593" name="Imagem 1"/>
+            <wp:cNvGraphicFramePr>
+              <a:graphicFrameLocks xmlns:a="http://schemas.openxmlformats.org/drawingml/2006/main" noChangeAspect="1"/>
+            </wp:cNvGraphicFramePr>
+            <a:graphic xmlns:a="http://schemas.openxmlformats.org/drawingml/2006/main">
+              <a:graphicData uri="http://schemas.openxmlformats.org/drawingml/2006/picture">
+                <pic:pic xmlns:pic="http://schemas.openxmlformats.org/drawingml/2006/picture">
+                  <pic:nvPicPr>
+                    <pic:cNvPr id="1807642593" name=""/>
+                    <pic:cNvPicPr/>
+                  </pic:nvPicPr>
+                  <pic:blipFill>
+                    <a:blip r:embed="rId10"/>
+                    <a:stretch>
+                      <a:fillRect/>
+                    </a:stretch>
+                  </pic:blipFill>
+                  <pic:spPr>
+                    <a:xfrm>
+                      <a:off x="0" y="0"/>
+                      <a:ext cx="4638046" cy="3240000"/>
+                    </a:xfrm>
+                    <a:prstGeom prst="rect">
+                      <a:avLst/>
+                    </a:prstGeom>
+                  </pic:spPr>
+                </pic:pic>
+              </a:graphicData>
+            </a:graphic>
+          </wp:inline>
+        </w:drawing>
+      </w:r>
+    </w:p>
+    <w:p>
+      <w:pPr>
         <w:numPr>
           <w:ilvl w:val="0"/>
           <w:numId w:val="3"/>
@@ -2304,7 +2414,103 @@
         <w:jc w:val="both"/>
       </w:pPr>
       <w:r>
-        <w:t>Tela de cadastro de laboratórios</w:t>
+        <w:t>Tela de cadastro de equipamentos</w:t>
+      </w:r>
+    </w:p>
+    <w:p>
+      <w:pPr>
+        <w:ind w:left="1276"/>
+        <w:jc w:val="both"/>
+      </w:pPr>
+      <w:r>
+        <w:drawing>
+          <wp:inline distT="0" distB="0" distL="0" distR="0" wp14:anchorId="4A25BB7B" wp14:editId="24963859">
+            <wp:extent cx="4680000" cy="3244326"/>
+            <wp:effectExtent l="0" t="0" r="6350" b="0"/>
+            <wp:docPr id="1445108196" name="Imagem 1"/>
+            <wp:cNvGraphicFramePr>
+              <a:graphicFrameLocks xmlns:a="http://schemas.openxmlformats.org/drawingml/2006/main" noChangeAspect="1"/>
+            </wp:cNvGraphicFramePr>
+            <a:graphic xmlns:a="http://schemas.openxmlformats.org/drawingml/2006/main">
+              <a:graphicData uri="http://schemas.openxmlformats.org/drawingml/2006/picture">
+                <pic:pic xmlns:pic="http://schemas.openxmlformats.org/drawingml/2006/picture">
+                  <pic:nvPicPr>
+                    <pic:cNvPr id="1445108196" name=""/>
+                    <pic:cNvPicPr/>
+                  </pic:nvPicPr>
+                  <pic:blipFill>
+                    <a:blip r:embed="rId11"/>
+                    <a:stretch>
+                      <a:fillRect/>
+                    </a:stretch>
+                  </pic:blipFill>
+                  <pic:spPr>
+                    <a:xfrm>
+                      <a:off x="0" y="0"/>
+                      <a:ext cx="4680000" cy="3244326"/>
+                    </a:xfrm>
+                    <a:prstGeom prst="rect">
+                      <a:avLst/>
+                    </a:prstGeom>
+                  </pic:spPr>
+                </pic:pic>
+              </a:graphicData>
+            </a:graphic>
+          </wp:inline>
+        </w:drawing>
+      </w:r>
+    </w:p>
+    <w:p>
+      <w:pPr>
+        <w:numPr>
+          <w:ilvl w:val="0"/>
+          <w:numId w:val="3"/>
+        </w:numPr>
+        <w:tabs>
+          <w:tab w:val="clear" w:pos="720"/>
+        </w:tabs>
+        <w:ind w:left="1276"/>
+      </w:pPr>
+      <w:r>
+        <w:lastRenderedPageBreak/>
+        <w:t>Tela de cadastro de professores</w:t>
+      </w:r>
+      <w:r>
+        <w:drawing>
+          <wp:inline distT="0" distB="0" distL="0" distR="0" wp14:anchorId="690D4871" wp14:editId="3DA0FD67">
+            <wp:extent cx="4680000" cy="3207183"/>
+            <wp:effectExtent l="0" t="0" r="6350" b="0"/>
+            <wp:docPr id="1748794345" name="Imagem 1"/>
+            <wp:cNvGraphicFramePr>
+              <a:graphicFrameLocks xmlns:a="http://schemas.openxmlformats.org/drawingml/2006/main" noChangeAspect="1"/>
+            </wp:cNvGraphicFramePr>
+            <a:graphic xmlns:a="http://schemas.openxmlformats.org/drawingml/2006/main">
+              <a:graphicData uri="http://schemas.openxmlformats.org/drawingml/2006/picture">
+                <pic:pic xmlns:pic="http://schemas.openxmlformats.org/drawingml/2006/picture">
+                  <pic:nvPicPr>
+                    <pic:cNvPr id="1748794345" name=""/>
+                    <pic:cNvPicPr/>
+                  </pic:nvPicPr>
+                  <pic:blipFill>
+                    <a:blip r:embed="rId12"/>
+                    <a:stretch>
+                      <a:fillRect/>
+                    </a:stretch>
+                  </pic:blipFill>
+                  <pic:spPr>
+                    <a:xfrm>
+                      <a:off x="0" y="0"/>
+                      <a:ext cx="4680000" cy="3207183"/>
+                    </a:xfrm>
+                    <a:prstGeom prst="rect">
+                      <a:avLst/>
+                    </a:prstGeom>
+                  </pic:spPr>
+                </pic:pic>
+              </a:graphicData>
+            </a:graphic>
+          </wp:inline>
+        </w:drawing>
       </w:r>
     </w:p>
     <w:p>
@@ -2320,7 +2526,103 @@
         <w:jc w:val="both"/>
       </w:pPr>
       <w:r>
-        <w:t>Tela de cadastro de equipamentos</w:t>
+        <w:t>Tela de cadastro de técnicos</w:t>
+      </w:r>
+    </w:p>
+    <w:p>
+      <w:pPr>
+        <w:ind w:left="1276"/>
+        <w:jc w:val="both"/>
+      </w:pPr>
+      <w:r>
+        <w:drawing>
+          <wp:inline distT="0" distB="0" distL="0" distR="0" wp14:anchorId="4653B421" wp14:editId="43689BDD">
+            <wp:extent cx="4707173" cy="3239679"/>
+            <wp:effectExtent l="0" t="0" r="0" b="0"/>
+            <wp:docPr id="1759348015" name="Imagem 1"/>
+            <wp:cNvGraphicFramePr>
+              <a:graphicFrameLocks xmlns:a="http://schemas.openxmlformats.org/drawingml/2006/main" noChangeAspect="1"/>
+            </wp:cNvGraphicFramePr>
+            <a:graphic xmlns:a="http://schemas.openxmlformats.org/drawingml/2006/main">
+              <a:graphicData uri="http://schemas.openxmlformats.org/drawingml/2006/picture">
+                <pic:pic xmlns:pic="http://schemas.openxmlformats.org/drawingml/2006/picture">
+                  <pic:nvPicPr>
+                    <pic:cNvPr id="1759348015" name=""/>
+                    <pic:cNvPicPr/>
+                  </pic:nvPicPr>
+                  <pic:blipFill>
+                    <a:blip r:embed="rId13"/>
+                    <a:stretch>
+                      <a:fillRect/>
+                    </a:stretch>
+                  </pic:blipFill>
+                  <pic:spPr>
+                    <a:xfrm>
+                      <a:off x="0" y="0"/>
+                      <a:ext cx="4711592" cy="3242721"/>
+                    </a:xfrm>
+                    <a:prstGeom prst="rect">
+                      <a:avLst/>
+                    </a:prstGeom>
+                  </pic:spPr>
+                </pic:pic>
+              </a:graphicData>
+            </a:graphic>
+          </wp:inline>
+        </w:drawing>
+      </w:r>
+    </w:p>
+    <w:p>
+      <w:pPr>
+        <w:numPr>
+          <w:ilvl w:val="0"/>
+          <w:numId w:val="3"/>
+        </w:numPr>
+        <w:tabs>
+          <w:tab w:val="clear" w:pos="720"/>
+        </w:tabs>
+        <w:ind w:left="1276"/>
+      </w:pPr>
+      <w:r>
+        <w:lastRenderedPageBreak/>
+        <w:t>Tela de registro de ocorrências</w:t>
+      </w:r>
+      <w:r>
+        <w:drawing>
+          <wp:inline distT="0" distB="0" distL="0" distR="0" wp14:anchorId="608F6986" wp14:editId="78D01F21">
+            <wp:extent cx="4680000" cy="2880119"/>
+            <wp:effectExtent l="0" t="0" r="6350" b="0"/>
+            <wp:docPr id="500265219" name="Imagem 1"/>
+            <wp:cNvGraphicFramePr>
+              <a:graphicFrameLocks xmlns:a="http://schemas.openxmlformats.org/drawingml/2006/main" noChangeAspect="1"/>
+            </wp:cNvGraphicFramePr>
+            <a:graphic xmlns:a="http://schemas.openxmlformats.org/drawingml/2006/main">
+              <a:graphicData uri="http://schemas.openxmlformats.org/drawingml/2006/picture">
+                <pic:pic xmlns:pic="http://schemas.openxmlformats.org/drawingml/2006/picture">
+                  <pic:nvPicPr>
+                    <pic:cNvPr id="500265219" name=""/>
+                    <pic:cNvPicPr/>
+                  </pic:nvPicPr>
+                  <pic:blipFill>
+                    <a:blip r:embed="rId14"/>
+                    <a:stretch>
+                      <a:fillRect/>
+                    </a:stretch>
+                  </pic:blipFill>
+                  <pic:spPr>
+                    <a:xfrm>
+                      <a:off x="0" y="0"/>
+                      <a:ext cx="4680000" cy="2880119"/>
+                    </a:xfrm>
+                    <a:prstGeom prst="rect">
+                      <a:avLst/>
+                    </a:prstGeom>
+                  </pic:spPr>
+                </pic:pic>
+              </a:graphicData>
+            </a:graphic>
+          </wp:inline>
+        </w:drawing>
       </w:r>
     </w:p>
     <w:p>
@@ -2336,7 +2638,103 @@
         <w:jc w:val="both"/>
       </w:pPr>
       <w:r>
-        <w:t>Tela de cadastro de professores</w:t>
+        <w:t>Tela de consulta de ocorrências</w:t>
+      </w:r>
+    </w:p>
+    <w:p>
+      <w:pPr>
+        <w:ind w:left="1276"/>
+        <w:jc w:val="both"/>
+      </w:pPr>
+      <w:r>
+        <w:drawing>
+          <wp:inline distT="0" distB="0" distL="0" distR="0" wp14:anchorId="78342CCA" wp14:editId="4BF46220">
+            <wp:extent cx="4679950" cy="3239770"/>
+            <wp:effectExtent l="0" t="0" r="6350" b="0"/>
+            <wp:docPr id="49096929" name="Imagem 1"/>
+            <wp:cNvGraphicFramePr>
+              <a:graphicFrameLocks xmlns:a="http://schemas.openxmlformats.org/drawingml/2006/main" noChangeAspect="1"/>
+            </wp:cNvGraphicFramePr>
+            <a:graphic xmlns:a="http://schemas.openxmlformats.org/drawingml/2006/main">
+              <a:graphicData uri="http://schemas.openxmlformats.org/drawingml/2006/picture">
+                <pic:pic xmlns:pic="http://schemas.openxmlformats.org/drawingml/2006/picture">
+                  <pic:nvPicPr>
+                    <pic:cNvPr id="49096929" name=""/>
+                    <pic:cNvPicPr/>
+                  </pic:nvPicPr>
+                  <pic:blipFill>
+                    <a:blip r:embed="rId15"/>
+                    <a:stretch>
+                      <a:fillRect/>
+                    </a:stretch>
+                  </pic:blipFill>
+                  <pic:spPr>
+                    <a:xfrm>
+                      <a:off x="0" y="0"/>
+                      <a:ext cx="4685697" cy="3243748"/>
+                    </a:xfrm>
+                    <a:prstGeom prst="rect">
+                      <a:avLst/>
+                    </a:prstGeom>
+                  </pic:spPr>
+                </pic:pic>
+              </a:graphicData>
+            </a:graphic>
+          </wp:inline>
+        </w:drawing>
+      </w:r>
+    </w:p>
+    <w:p>
+      <w:pPr>
+        <w:numPr>
+          <w:ilvl w:val="0"/>
+          <w:numId w:val="3"/>
+        </w:numPr>
+        <w:tabs>
+          <w:tab w:val="clear" w:pos="720"/>
+        </w:tabs>
+        <w:ind w:left="1276"/>
+      </w:pPr>
+      <w:r>
+        <w:lastRenderedPageBreak/>
+        <w:t>Tela de monitor de chamados (acesso exclusivo para técnicos)</w:t>
+      </w:r>
+      <w:r>
+        <w:drawing>
+          <wp:inline distT="0" distB="0" distL="0" distR="0" wp14:anchorId="18B1C708" wp14:editId="772D4323">
+            <wp:extent cx="4841588" cy="3240000"/>
+            <wp:effectExtent l="0" t="0" r="0" b="0"/>
+            <wp:docPr id="999947318" name="Imagem 1"/>
+            <wp:cNvGraphicFramePr>
+              <a:graphicFrameLocks xmlns:a="http://schemas.openxmlformats.org/drawingml/2006/main" noChangeAspect="1"/>
+            </wp:cNvGraphicFramePr>
+            <a:graphic xmlns:a="http://schemas.openxmlformats.org/drawingml/2006/main">
+              <a:graphicData uri="http://schemas.openxmlformats.org/drawingml/2006/picture">
+                <pic:pic xmlns:pic="http://schemas.openxmlformats.org/drawingml/2006/picture">
+                  <pic:nvPicPr>
+                    <pic:cNvPr id="999947318" name=""/>
+                    <pic:cNvPicPr/>
+                  </pic:nvPicPr>
+                  <pic:blipFill>
+                    <a:blip r:embed="rId16"/>
+                    <a:stretch>
+                      <a:fillRect/>
+                    </a:stretch>
+                  </pic:blipFill>
+                  <pic:spPr>
+                    <a:xfrm>
+                      <a:off x="0" y="0"/>
+                      <a:ext cx="4841588" cy="3240000"/>
+                    </a:xfrm>
+                    <a:prstGeom prst="rect">
+                      <a:avLst/>
+                    </a:prstGeom>
+                  </pic:spPr>
+                </pic:pic>
+              </a:graphicData>
+            </a:graphic>
+          </wp:inline>
+        </w:drawing>
       </w:r>
     </w:p>
     <w:p>
@@ -2352,7 +2750,7 @@
         <w:jc w:val="both"/>
       </w:pPr>
       <w:r>
-        <w:t>Tela de cadastro de técnicos</w:t>
+        <w:t>Tela de relatórios</w:t>
       </w:r>
     </w:p>
     <w:p>
@@ -2368,72 +2766,46 @@
         <w:jc w:val="both"/>
       </w:pPr>
       <w:r>
-        <w:t>Tela de registro de ocorrências</w:t>
-      </w:r>
-    </w:p>
-    <w:p>
-      <w:pPr>
-        <w:numPr>
-          <w:ilvl w:val="0"/>
-          <w:numId w:val="3"/>
-        </w:numPr>
-        <w:tabs>
-          <w:tab w:val="clear" w:pos="720"/>
-        </w:tabs>
+        <w:drawing>
+          <wp:inline distT="0" distB="0" distL="0" distR="0" wp14:anchorId="78609D6C" wp14:editId="4EDAB2FE">
+            <wp:extent cx="4977517" cy="3239135"/>
+            <wp:effectExtent l="0" t="0" r="0" b="0"/>
+            <wp:docPr id="500292592" name="Imagem 1"/>
+            <wp:cNvGraphicFramePr>
+              <a:graphicFrameLocks xmlns:a="http://schemas.openxmlformats.org/drawingml/2006/main" noChangeAspect="1"/>
+            </wp:cNvGraphicFramePr>
+            <a:graphic xmlns:a="http://schemas.openxmlformats.org/drawingml/2006/main">
+              <a:graphicData uri="http://schemas.openxmlformats.org/drawingml/2006/picture">
+                <pic:pic xmlns:pic="http://schemas.openxmlformats.org/drawingml/2006/picture">
+                  <pic:nvPicPr>
+                    <pic:cNvPr id="500292592" name=""/>
+                    <pic:cNvPicPr/>
+                  </pic:nvPicPr>
+                  <pic:blipFill>
+                    <a:blip r:embed="rId17"/>
+                    <a:stretch>
+                      <a:fillRect/>
+                    </a:stretch>
+                  </pic:blipFill>
+                  <pic:spPr>
+                    <a:xfrm>
+                      <a:off x="0" y="0"/>
+                      <a:ext cx="4983772" cy="3243206"/>
+                    </a:xfrm>
+                    <a:prstGeom prst="rect">
+                      <a:avLst/>
+                    </a:prstGeom>
+                  </pic:spPr>
+                </pic:pic>
+              </a:graphicData>
+            </a:graphic>
+          </wp:inline>
+        </w:drawing>
+      </w:r>
+    </w:p>
+    <w:p>
+      <w:pPr>
         <w:ind w:left="1276"/>
-        <w:jc w:val="both"/>
-      </w:pPr>
-      <w:r>
-        <w:t>Tela de consulta de ocorrências</w:t>
-      </w:r>
-    </w:p>
-    <w:p>
-      <w:pPr>
-        <w:numPr>
-          <w:ilvl w:val="0"/>
-          <w:numId w:val="3"/>
-        </w:numPr>
-        <w:tabs>
-          <w:tab w:val="clear" w:pos="720"/>
-        </w:tabs>
-        <w:ind w:left="1276"/>
-        <w:jc w:val="both"/>
-      </w:pPr>
-      <w:r>
-        <w:t>Tela de monitor de chamados (acesso exclusivo para técnicos)</w:t>
-      </w:r>
-    </w:p>
-    <w:p>
-      <w:pPr>
-        <w:numPr>
-          <w:ilvl w:val="0"/>
-          <w:numId w:val="3"/>
-        </w:numPr>
-        <w:tabs>
-          <w:tab w:val="clear" w:pos="720"/>
-        </w:tabs>
-        <w:ind w:left="1276"/>
-        <w:jc w:val="both"/>
-      </w:pPr>
-      <w:r>
-        <w:t>Tela de relatórios</w:t>
-      </w:r>
-    </w:p>
-    <w:p>
-      <w:pPr>
-        <w:ind w:left="851"/>
-        <w:jc w:val="both"/>
-      </w:pPr>
-      <w:r>
-        <w:rPr>
-          <w:highlight w:val="yellow"/>
-        </w:rPr>
-        <w:t>Colocar prints das telas com suas identificações</w:t>
-      </w:r>
-    </w:p>
-    <w:p>
-      <w:pPr>
-        <w:ind w:left="851"/>
         <w:jc w:val="both"/>
       </w:pPr>
     </w:p>
@@ -2503,6 +2875,7 @@
         <w:jc w:val="both"/>
       </w:pPr>
       <w:r>
+        <w:lastRenderedPageBreak/>
         <w:t xml:space="preserve">Interpretador PHP 8.4 (com extensões: </w:t>
       </w:r>
       <w:proofErr w:type="spellStart"/>
@@ -2547,7 +2920,6 @@
         <w:jc w:val="both"/>
       </w:pPr>
       <w:r>
-        <w:lastRenderedPageBreak/>
         <w:t>MySQL 8.4 (SGBD) acessado via PDO</w:t>
       </w:r>
     </w:p>
@@ -2739,7 +3111,7 @@
                     </pic:cNvPicPr>
                   </pic:nvPicPr>
                   <pic:blipFill>
-                    <a:blip r:embed="rId9">
+                    <a:blip r:embed="rId18">
                       <a:extLst>
                         <a:ext uri="{28A0092B-C50C-407E-A947-70E740481C1C}">
                           <a14:useLocalDpi xmlns:a14="http://schemas.microsoft.com/office/drawing/2010/main" val="0"/>
@@ -3964,7 +4336,7 @@
                     <pic:cNvPicPr/>
                   </pic:nvPicPr>
                   <pic:blipFill>
-                    <a:blip r:embed="rId10"/>
+                    <a:blip r:embed="rId19"/>
                     <a:stretch>
                       <a:fillRect/>
                     </a:stretch>
@@ -21720,9 +22092,9 @@
           <w:rFonts w:cs="Times New Roman"/>
         </w:rPr>
         <w:sectPr>
-          <w:headerReference w:type="default" r:id="rId11"/>
-          <w:headerReference w:type="first" r:id="rId12"/>
-          <w:footerReference w:type="first" r:id="rId13"/>
+          <w:headerReference w:type="default" r:id="rId20"/>
+          <w:headerReference w:type="first" r:id="rId21"/>
+          <w:footerReference w:type="first" r:id="rId22"/>
           <w:pgSz w:w="11907" w:h="16839"/>
           <w:pgMar w:top="1701" w:right="1134" w:bottom="1134" w:left="1701" w:header="720" w:footer="720" w:gutter="0"/>
           <w:cols w:space="708"/>
@@ -26958,7 +27330,6 @@
   <w:style w:type="character" w:default="1" w:styleId="Fontepargpadro">
     <w:name w:val="Default Paragraph Font"/>
     <w:uiPriority w:val="1"/>
-    <w:semiHidden/>
     <w:unhideWhenUsed/>
   </w:style>
   <w:style w:type="table" w:default="1" w:styleId="Tabelanormal">

</xml_diff>

<commit_message>
Conclusão da fase 3 do projeto
</commit_message>
<xml_diff>
--- a/Documentacao/Projeto_Integrador_TADS.docx
+++ b/Documentacao/Projeto_Integrador_TADS.docx
@@ -2018,7 +2018,15 @@
         <w:jc w:val="both"/>
       </w:pPr>
       <w:r>
-        <w:t>TADS – TECNOLOGIA E ANALISE DE DESENVOLVIMENTO DE SISTEMAS</w:t>
+        <w:t xml:space="preserve">TADS – TECNOLOGIA E </w:t>
+      </w:r>
+      <w:proofErr w:type="gramStart"/>
+      <w:r>
+        <w:t>ANALISE</w:t>
+      </w:r>
+      <w:proofErr w:type="gramEnd"/>
+      <w:r>
+        <w:t xml:space="preserve"> DE DESENVOLVIMENTO DE SISTEMAS</w:t>
       </w:r>
     </w:p>
     <w:p>
@@ -2298,9 +2306,46 @@
       </w:r>
     </w:p>
     <w:p>
-      <w:pPr>
-        <w:jc w:val="both"/>
-      </w:pPr>
+      <w:r>
+        <w:t xml:space="preserve">/* </w:t>
+      </w:r>
+      <w:r>
+        <w:t xml:space="preserve">-- Senhas dos </w:t>
+      </w:r>
+      <w:proofErr w:type="spellStart"/>
+      <w:r>
+        <w:t>usuarios</w:t>
+      </w:r>
+      <w:proofErr w:type="spellEnd"/>
+      <w:r>
+        <w:t xml:space="preserve"> </w:t>
+      </w:r>
+      <w:proofErr w:type="spellStart"/>
+      <w:r>
+        <w:t>seed</w:t>
+      </w:r>
+      <w:proofErr w:type="spellEnd"/>
+      <w:r>
+        <w:t>:</w:t>
+      </w:r>
+    </w:p>
+    <w:p>
+      <w:r>
+        <w:t>-- gestor@unieinstein.edu.br    / Gestor@123</w:t>
+      </w:r>
+    </w:p>
+    <w:p>
+      <w:r>
+        <w:t>-- professor@unieinstein.edu.br / Professor@123</w:t>
+      </w:r>
+    </w:p>
+    <w:p>
+      <w:r>
+        <w:t>-- tecnico@unieinstein.edu.br   / Tecnico@123</w:t>
+      </w:r>
+      <w:r>
+        <w:t xml:space="preserve"> */</w:t>
+      </w:r>
     </w:p>
     <w:p>
       <w:pPr>
@@ -2327,6 +2372,7 @@
         <w:rPr>
           <w:noProof/>
         </w:rPr>
+        <w:lastRenderedPageBreak/>
         <w:drawing>
           <wp:inline distT="0" distB="0" distL="0" distR="0" wp14:anchorId="3965EC29" wp14:editId="55077600">
             <wp:extent cx="2850995" cy="3240000"/>
@@ -2376,7 +2422,6 @@
         <w:ind w:left="1276"/>
       </w:pPr>
       <w:r>
-        <w:lastRenderedPageBreak/>
         <w:t>Tela de cadastro de laboratórios</w:t>
       </w:r>
       <w:r>
@@ -2445,6 +2490,7 @@
         <w:rPr>
           <w:noProof/>
         </w:rPr>
+        <w:lastRenderedPageBreak/>
         <w:drawing>
           <wp:inline distT="0" distB="0" distL="0" distR="0" wp14:anchorId="4A25BB7B" wp14:editId="24963859">
             <wp:extent cx="4680000" cy="3244326"/>
@@ -2494,7 +2540,6 @@
         <w:ind w:left="1276"/>
       </w:pPr>
       <w:r>
-        <w:lastRenderedPageBreak/>
         <w:t>Tela de cadastro de professores</w:t>
       </w:r>
       <w:r>
@@ -2563,6 +2608,7 @@
         <w:rPr>
           <w:noProof/>
         </w:rPr>
+        <w:lastRenderedPageBreak/>
         <w:drawing>
           <wp:inline distT="0" distB="0" distL="0" distR="0" wp14:anchorId="4653B421" wp14:editId="43689BDD">
             <wp:extent cx="4707173" cy="3239679"/>
@@ -2612,7 +2658,6 @@
         <w:ind w:left="1276"/>
       </w:pPr>
       <w:r>
-        <w:lastRenderedPageBreak/>
         <w:t>Tela de registro de ocorrências</w:t>
       </w:r>
       <w:r>
@@ -2681,6 +2726,7 @@
         <w:rPr>
           <w:noProof/>
         </w:rPr>
+        <w:lastRenderedPageBreak/>
         <w:drawing>
           <wp:inline distT="0" distB="0" distL="0" distR="0" wp14:anchorId="78342CCA" wp14:editId="4BF46220">
             <wp:extent cx="4679950" cy="3239770"/>
@@ -2730,7 +2776,6 @@
         <w:ind w:left="1276"/>
       </w:pPr>
       <w:r>
-        <w:lastRenderedPageBreak/>
         <w:t>Tela de monitor de chamados (acesso exclusivo para técnicos)</w:t>
       </w:r>
       <w:r>
@@ -2806,6 +2851,7 @@
         <w:rPr>
           <w:noProof/>
         </w:rPr>
+        <w:lastRenderedPageBreak/>
         <w:drawing>
           <wp:inline distT="0" distB="0" distL="0" distR="0" wp14:anchorId="78609D6C" wp14:editId="4EDAB2FE">
             <wp:extent cx="4977517" cy="3239135"/>
@@ -2915,7 +2961,6 @@
         <w:jc w:val="both"/>
       </w:pPr>
       <w:r>
-        <w:lastRenderedPageBreak/>
         <w:t xml:space="preserve">Interpretador PHP 8.4 (com extensões: </w:t>
       </w:r>
       <w:proofErr w:type="spellStart"/>
@@ -3083,6 +3128,7 @@
         <w:jc w:val="both"/>
       </w:pPr>
       <w:r>
+        <w:lastRenderedPageBreak/>
         <w:t xml:space="preserve">O sistema deverá operar em servidores que suportem PHP 8.4 e MySQL 8.4. Para o ambiente de desenvolvimento, será utilizado o XAMPP 8.4, que inclui Apache, PHP 8.4 e </w:t>
       </w:r>
       <w:proofErr w:type="spellStart"/>
@@ -7782,14 +7828,25 @@
                 <w:lang w:eastAsia="zh-CN"/>
               </w:rPr>
             </w:pPr>
-            <w:r>
-              <w:rPr>
-                <w:rFonts w:ascii="Calibri" w:eastAsia="SimSun" w:hAnsi="Calibri" w:cs="Times New Roman"/>
-                <w:sz w:val="20"/>
-                <w:szCs w:val="20"/>
-                <w:lang w:val="en-US" w:eastAsia="zh-CN"/>
-              </w:rPr>
-              <w:t>NOW()</w:t>
+            <w:proofErr w:type="gramStart"/>
+            <w:r>
+              <w:rPr>
+                <w:rFonts w:ascii="Calibri" w:eastAsia="SimSun" w:hAnsi="Calibri" w:cs="Times New Roman"/>
+                <w:sz w:val="20"/>
+                <w:szCs w:val="20"/>
+                <w:lang w:val="en-US" w:eastAsia="zh-CN"/>
+              </w:rPr>
+              <w:t>NOW(</w:t>
+            </w:r>
+            <w:proofErr w:type="gramEnd"/>
+            <w:r>
+              <w:rPr>
+                <w:rFonts w:ascii="Calibri" w:eastAsia="SimSun" w:hAnsi="Calibri" w:cs="Times New Roman"/>
+                <w:sz w:val="20"/>
+                <w:szCs w:val="20"/>
+                <w:lang w:val="en-US" w:eastAsia="zh-CN"/>
+              </w:rPr>
+              <w:t>)</w:t>
             </w:r>
           </w:p>
         </w:tc>
@@ -16967,8 +17024,19 @@
                 <w:szCs w:val="20"/>
                 <w:lang w:eastAsia="zh-CN"/>
               </w:rPr>
-              <w:t>, Em Atendimento, Encerrada</w:t>
-            </w:r>
+              <w:t xml:space="preserve">, Em Atendimento, </w:t>
+            </w:r>
+            <w:proofErr w:type="gramStart"/>
+            <w:r>
+              <w:rPr>
+                <w:rFonts w:ascii="Calibri" w:eastAsia="SimSun" w:hAnsi="Calibri" w:cs="Times New Roman"/>
+                <w:sz w:val="20"/>
+                <w:szCs w:val="20"/>
+                <w:lang w:eastAsia="zh-CN"/>
+              </w:rPr>
+              <w:t>Encerrada</w:t>
+            </w:r>
+            <w:proofErr w:type="gramEnd"/>
           </w:p>
         </w:tc>
       </w:tr>
@@ -17214,14 +17282,25 @@
                 <w:lang w:val="en-US" w:eastAsia="zh-CN"/>
               </w:rPr>
             </w:pPr>
-            <w:r>
-              <w:rPr>
-                <w:rFonts w:ascii="Calibri" w:eastAsia="SimSun" w:hAnsi="Calibri" w:cs="Times New Roman"/>
-                <w:sz w:val="20"/>
-                <w:szCs w:val="20"/>
-                <w:lang w:val="en-US" w:eastAsia="zh-CN"/>
-              </w:rPr>
-              <w:t>NOW()</w:t>
+            <w:proofErr w:type="gramStart"/>
+            <w:r>
+              <w:rPr>
+                <w:rFonts w:ascii="Calibri" w:eastAsia="SimSun" w:hAnsi="Calibri" w:cs="Times New Roman"/>
+                <w:sz w:val="20"/>
+                <w:szCs w:val="20"/>
+                <w:lang w:val="en-US" w:eastAsia="zh-CN"/>
+              </w:rPr>
+              <w:t>NOW(</w:t>
+            </w:r>
+            <w:proofErr w:type="gramEnd"/>
+            <w:r>
+              <w:rPr>
+                <w:rFonts w:ascii="Calibri" w:eastAsia="SimSun" w:hAnsi="Calibri" w:cs="Times New Roman"/>
+                <w:sz w:val="20"/>
+                <w:szCs w:val="20"/>
+                <w:lang w:val="en-US" w:eastAsia="zh-CN"/>
+              </w:rPr>
+              <w:t>)</w:t>
             </w:r>
           </w:p>
         </w:tc>
@@ -18012,6 +18091,7 @@
           <w:lang w:eastAsia="pt-BR"/>
         </w:rPr>
       </w:pPr>
+      <w:proofErr w:type="gramStart"/>
       <w:r>
         <w:rPr>
           <w:rFonts w:ascii="Courier New" w:eastAsia="Courier New" w:hAnsi="Courier New" w:cs="Courier New"/>
@@ -18020,7 +18100,18 @@
           <w:szCs w:val="18"/>
           <w:lang w:eastAsia="pt-BR"/>
         </w:rPr>
-        <w:t>--  Sistema Relator de Problemas em Laboratório</w:t>
+        <w:t>--  Sistema</w:t>
+      </w:r>
+      <w:proofErr w:type="gramEnd"/>
+      <w:r>
+        <w:rPr>
+          <w:rFonts w:ascii="Courier New" w:eastAsia="Courier New" w:hAnsi="Courier New" w:cs="Courier New"/>
+          <w:color w:val="007700"/>
+          <w:sz w:val="18"/>
+          <w:szCs w:val="18"/>
+          <w:lang w:eastAsia="pt-BR"/>
+        </w:rPr>
+        <w:t xml:space="preserve"> Relator de Problemas em Laboratório</w:t>
       </w:r>
     </w:p>
     <w:p>
@@ -18032,6 +18123,7 @@
           <w:lang w:eastAsia="pt-BR"/>
         </w:rPr>
       </w:pPr>
+      <w:proofErr w:type="gramStart"/>
       <w:r>
         <w:rPr>
           <w:rFonts w:ascii="Courier New" w:eastAsia="Courier New" w:hAnsi="Courier New" w:cs="Courier New"/>
@@ -18040,7 +18132,18 @@
           <w:szCs w:val="18"/>
           <w:lang w:eastAsia="pt-BR"/>
         </w:rPr>
-        <w:t>--  Script SQL - MySQL 8.4</w:t>
+        <w:t>--  Script</w:t>
+      </w:r>
+      <w:proofErr w:type="gramEnd"/>
+      <w:r>
+        <w:rPr>
+          <w:rFonts w:ascii="Courier New" w:eastAsia="Courier New" w:hAnsi="Courier New" w:cs="Courier New"/>
+          <w:color w:val="007700"/>
+          <w:sz w:val="18"/>
+          <w:szCs w:val="18"/>
+          <w:lang w:eastAsia="pt-BR"/>
+        </w:rPr>
+        <w:t xml:space="preserve"> SQL - MySQL 8.4</w:t>
       </w:r>
     </w:p>
     <w:p>
@@ -18052,6 +18155,7 @@
           <w:lang w:eastAsia="pt-BR"/>
         </w:rPr>
       </w:pPr>
+      <w:proofErr w:type="gramStart"/>
       <w:r>
         <w:rPr>
           <w:rFonts w:ascii="Courier New" w:eastAsia="Courier New" w:hAnsi="Courier New" w:cs="Courier New"/>
@@ -18060,7 +18164,18 @@
           <w:szCs w:val="18"/>
           <w:lang w:eastAsia="pt-BR"/>
         </w:rPr>
-        <w:t>--  Gerado em: 2026</w:t>
+        <w:t>--  Gerado</w:t>
+      </w:r>
+      <w:proofErr w:type="gramEnd"/>
+      <w:r>
+        <w:rPr>
+          <w:rFonts w:ascii="Courier New" w:eastAsia="Courier New" w:hAnsi="Courier New" w:cs="Courier New"/>
+          <w:color w:val="007700"/>
+          <w:sz w:val="18"/>
+          <w:szCs w:val="18"/>
+          <w:lang w:eastAsia="pt-BR"/>
+        </w:rPr>
+        <w:t xml:space="preserve"> em: 2026</w:t>
       </w:r>
     </w:p>
     <w:p>
@@ -18398,7 +18513,51 @@
           <w:szCs w:val="18"/>
           <w:lang w:val="en-US" w:eastAsia="pt-BR"/>
         </w:rPr>
-        <w:t xml:space="preserve">          VARCHAR(100)  NOT NULL,</w:t>
+        <w:t xml:space="preserve">          </w:t>
+      </w:r>
+      <w:proofErr w:type="gramStart"/>
+      <w:r>
+        <w:rPr>
+          <w:rFonts w:ascii="Courier New" w:eastAsia="Courier New" w:hAnsi="Courier New" w:cs="Courier New"/>
+          <w:color w:val="000000"/>
+          <w:sz w:val="18"/>
+          <w:szCs w:val="18"/>
+          <w:lang w:val="en-US" w:eastAsia="pt-BR"/>
+        </w:rPr>
+        <w:t>VARCHAR(</w:t>
+      </w:r>
+      <w:proofErr w:type="gramEnd"/>
+      <w:r>
+        <w:rPr>
+          <w:rFonts w:ascii="Courier New" w:eastAsia="Courier New" w:hAnsi="Courier New" w:cs="Courier New"/>
+          <w:color w:val="000000"/>
+          <w:sz w:val="18"/>
+          <w:szCs w:val="18"/>
+          <w:lang w:val="en-US" w:eastAsia="pt-BR"/>
+        </w:rPr>
+        <w:t>100</w:t>
+      </w:r>
+      <w:proofErr w:type="gramStart"/>
+      <w:r>
+        <w:rPr>
+          <w:rFonts w:ascii="Courier New" w:eastAsia="Courier New" w:hAnsi="Courier New" w:cs="Courier New"/>
+          <w:color w:val="000000"/>
+          <w:sz w:val="18"/>
+          <w:szCs w:val="18"/>
+          <w:lang w:val="en-US" w:eastAsia="pt-BR"/>
+        </w:rPr>
+        <w:t>)  NOT</w:t>
+      </w:r>
+      <w:proofErr w:type="gramEnd"/>
+      <w:r>
+        <w:rPr>
+          <w:rFonts w:ascii="Courier New" w:eastAsia="Courier New" w:hAnsi="Courier New" w:cs="Courier New"/>
+          <w:color w:val="000000"/>
+          <w:sz w:val="18"/>
+          <w:szCs w:val="18"/>
+          <w:lang w:val="en-US" w:eastAsia="pt-BR"/>
+        </w:rPr>
+        <w:t xml:space="preserve"> NULL,</w:t>
       </w:r>
     </w:p>
     <w:p>
@@ -18418,7 +18577,51 @@
           <w:szCs w:val="18"/>
           <w:lang w:val="en-US" w:eastAsia="pt-BR"/>
         </w:rPr>
-        <w:t xml:space="preserve">  email         VARCHAR(150)  NOT NULL,</w:t>
+        <w:t xml:space="preserve">  email         </w:t>
+      </w:r>
+      <w:proofErr w:type="gramStart"/>
+      <w:r>
+        <w:rPr>
+          <w:rFonts w:ascii="Courier New" w:eastAsia="Courier New" w:hAnsi="Courier New" w:cs="Courier New"/>
+          <w:color w:val="000000"/>
+          <w:sz w:val="18"/>
+          <w:szCs w:val="18"/>
+          <w:lang w:val="en-US" w:eastAsia="pt-BR"/>
+        </w:rPr>
+        <w:t>VARCHAR(</w:t>
+      </w:r>
+      <w:proofErr w:type="gramEnd"/>
+      <w:r>
+        <w:rPr>
+          <w:rFonts w:ascii="Courier New" w:eastAsia="Courier New" w:hAnsi="Courier New" w:cs="Courier New"/>
+          <w:color w:val="000000"/>
+          <w:sz w:val="18"/>
+          <w:szCs w:val="18"/>
+          <w:lang w:val="en-US" w:eastAsia="pt-BR"/>
+        </w:rPr>
+        <w:t>150</w:t>
+      </w:r>
+      <w:proofErr w:type="gramStart"/>
+      <w:r>
+        <w:rPr>
+          <w:rFonts w:ascii="Courier New" w:eastAsia="Courier New" w:hAnsi="Courier New" w:cs="Courier New"/>
+          <w:color w:val="000000"/>
+          <w:sz w:val="18"/>
+          <w:szCs w:val="18"/>
+          <w:lang w:val="en-US" w:eastAsia="pt-BR"/>
+        </w:rPr>
+        <w:t>)  NOT</w:t>
+      </w:r>
+      <w:proofErr w:type="gramEnd"/>
+      <w:r>
+        <w:rPr>
+          <w:rFonts w:ascii="Courier New" w:eastAsia="Courier New" w:hAnsi="Courier New" w:cs="Courier New"/>
+          <w:color w:val="000000"/>
+          <w:sz w:val="18"/>
+          <w:szCs w:val="18"/>
+          <w:lang w:val="en-US" w:eastAsia="pt-BR"/>
+        </w:rPr>
+        <w:t xml:space="preserve"> NULL,</w:t>
       </w:r>
     </w:p>
     <w:p>
@@ -18460,7 +18663,51 @@
           <w:szCs w:val="18"/>
           <w:lang w:val="en-US" w:eastAsia="pt-BR"/>
         </w:rPr>
-        <w:t xml:space="preserve">         VARCHAR(255)  NOT NULL COMMENT 'Hash </w:t>
+        <w:t xml:space="preserve">         </w:t>
+      </w:r>
+      <w:proofErr w:type="gramStart"/>
+      <w:r>
+        <w:rPr>
+          <w:rFonts w:ascii="Courier New" w:eastAsia="Courier New" w:hAnsi="Courier New" w:cs="Courier New"/>
+          <w:color w:val="000000"/>
+          <w:sz w:val="18"/>
+          <w:szCs w:val="18"/>
+          <w:lang w:val="en-US" w:eastAsia="pt-BR"/>
+        </w:rPr>
+        <w:t>VARCHAR(</w:t>
+      </w:r>
+      <w:proofErr w:type="gramEnd"/>
+      <w:r>
+        <w:rPr>
+          <w:rFonts w:ascii="Courier New" w:eastAsia="Courier New" w:hAnsi="Courier New" w:cs="Courier New"/>
+          <w:color w:val="000000"/>
+          <w:sz w:val="18"/>
+          <w:szCs w:val="18"/>
+          <w:lang w:val="en-US" w:eastAsia="pt-BR"/>
+        </w:rPr>
+        <w:t>255</w:t>
+      </w:r>
+      <w:proofErr w:type="gramStart"/>
+      <w:r>
+        <w:rPr>
+          <w:rFonts w:ascii="Courier New" w:eastAsia="Courier New" w:hAnsi="Courier New" w:cs="Courier New"/>
+          <w:color w:val="000000"/>
+          <w:sz w:val="18"/>
+          <w:szCs w:val="18"/>
+          <w:lang w:val="en-US" w:eastAsia="pt-BR"/>
+        </w:rPr>
+        <w:t>)  NOT</w:t>
+      </w:r>
+      <w:proofErr w:type="gramEnd"/>
+      <w:r>
+        <w:rPr>
+          <w:rFonts w:ascii="Courier New" w:eastAsia="Courier New" w:hAnsi="Courier New" w:cs="Courier New"/>
+          <w:color w:val="000000"/>
+          <w:sz w:val="18"/>
+          <w:szCs w:val="18"/>
+          <w:lang w:val="en-US" w:eastAsia="pt-BR"/>
+        </w:rPr>
+        <w:t xml:space="preserve"> NULL COMMENT 'Hash </w:t>
       </w:r>
       <w:proofErr w:type="spellStart"/>
       <w:r>
@@ -18493,7 +18740,18 @@
           <w:szCs w:val="18"/>
           <w:lang w:val="en-US" w:eastAsia="pt-BR"/>
         </w:rPr>
-        <w:t>password_hash</w:t>
+        <w:t>password_</w:t>
+      </w:r>
+      <w:proofErr w:type="gramStart"/>
+      <w:r>
+        <w:rPr>
+          <w:rFonts w:ascii="Courier New" w:eastAsia="Courier New" w:hAnsi="Courier New" w:cs="Courier New"/>
+          <w:color w:val="000000"/>
+          <w:sz w:val="18"/>
+          <w:szCs w:val="18"/>
+          <w:lang w:val="en-US" w:eastAsia="pt-BR"/>
+        </w:rPr>
+        <w:t>hash</w:t>
       </w:r>
       <w:proofErr w:type="spellEnd"/>
       <w:r>
@@ -18504,7 +18762,18 @@
           <w:szCs w:val="18"/>
           <w:lang w:val="en-US" w:eastAsia="pt-BR"/>
         </w:rPr>
-        <w:t>()',</w:t>
+        <w:t>(</w:t>
+      </w:r>
+      <w:proofErr w:type="gramEnd"/>
+      <w:r>
+        <w:rPr>
+          <w:rFonts w:ascii="Courier New" w:eastAsia="Courier New" w:hAnsi="Courier New" w:cs="Courier New"/>
+          <w:color w:val="000000"/>
+          <w:sz w:val="18"/>
+          <w:szCs w:val="18"/>
+          <w:lang w:val="en-US" w:eastAsia="pt-BR"/>
+        </w:rPr>
+        <w:t>)',</w:t>
       </w:r>
     </w:p>
     <w:p>
@@ -18598,7 +18867,29 @@
           <w:szCs w:val="18"/>
           <w:lang w:val="en-US" w:eastAsia="pt-BR"/>
         </w:rPr>
-        <w:t xml:space="preserve">         TINYINT(1)    NOT NULL DEFAULT 1,</w:t>
+        <w:t xml:space="preserve">         </w:t>
+      </w:r>
+      <w:proofErr w:type="gramStart"/>
+      <w:r>
+        <w:rPr>
+          <w:rFonts w:ascii="Courier New" w:eastAsia="Courier New" w:hAnsi="Courier New" w:cs="Courier New"/>
+          <w:color w:val="000000"/>
+          <w:sz w:val="18"/>
+          <w:szCs w:val="18"/>
+          <w:lang w:val="en-US" w:eastAsia="pt-BR"/>
+        </w:rPr>
+        <w:t>TINYINT(</w:t>
+      </w:r>
+      <w:proofErr w:type="gramEnd"/>
+      <w:r>
+        <w:rPr>
+          <w:rFonts w:ascii="Courier New" w:eastAsia="Courier New" w:hAnsi="Courier New" w:cs="Courier New"/>
+          <w:color w:val="000000"/>
+          <w:sz w:val="18"/>
+          <w:szCs w:val="18"/>
+          <w:lang w:val="en-US" w:eastAsia="pt-BR"/>
+        </w:rPr>
+        <w:t>1)    NOT NULL DEFAULT 1,</w:t>
       </w:r>
     </w:p>
     <w:p>
@@ -18922,7 +19213,51 @@
           <w:szCs w:val="18"/>
           <w:lang w:val="en-US" w:eastAsia="pt-BR"/>
         </w:rPr>
-        <w:t xml:space="preserve">        VARCHAR(100)  NOT NULL,</w:t>
+        <w:t xml:space="preserve">        </w:t>
+      </w:r>
+      <w:proofErr w:type="gramStart"/>
+      <w:r>
+        <w:rPr>
+          <w:rFonts w:ascii="Courier New" w:eastAsia="Courier New" w:hAnsi="Courier New" w:cs="Courier New"/>
+          <w:color w:val="000000"/>
+          <w:sz w:val="18"/>
+          <w:szCs w:val="18"/>
+          <w:lang w:val="en-US" w:eastAsia="pt-BR"/>
+        </w:rPr>
+        <w:t>VARCHAR(</w:t>
+      </w:r>
+      <w:proofErr w:type="gramEnd"/>
+      <w:r>
+        <w:rPr>
+          <w:rFonts w:ascii="Courier New" w:eastAsia="Courier New" w:hAnsi="Courier New" w:cs="Courier New"/>
+          <w:color w:val="000000"/>
+          <w:sz w:val="18"/>
+          <w:szCs w:val="18"/>
+          <w:lang w:val="en-US" w:eastAsia="pt-BR"/>
+        </w:rPr>
+        <w:t>100</w:t>
+      </w:r>
+      <w:proofErr w:type="gramStart"/>
+      <w:r>
+        <w:rPr>
+          <w:rFonts w:ascii="Courier New" w:eastAsia="Courier New" w:hAnsi="Courier New" w:cs="Courier New"/>
+          <w:color w:val="000000"/>
+          <w:sz w:val="18"/>
+          <w:szCs w:val="18"/>
+          <w:lang w:val="en-US" w:eastAsia="pt-BR"/>
+        </w:rPr>
+        <w:t>)  NOT</w:t>
+      </w:r>
+      <w:proofErr w:type="gramEnd"/>
+      <w:r>
+        <w:rPr>
+          <w:rFonts w:ascii="Courier New" w:eastAsia="Courier New" w:hAnsi="Courier New" w:cs="Courier New"/>
+          <w:color w:val="000000"/>
+          <w:sz w:val="18"/>
+          <w:szCs w:val="18"/>
+          <w:lang w:val="en-US" w:eastAsia="pt-BR"/>
+        </w:rPr>
+        <w:t xml:space="preserve"> NULL,</w:t>
       </w:r>
     </w:p>
     <w:p>
@@ -18964,7 +19299,51 @@
           <w:szCs w:val="18"/>
           <w:lang w:val="en-US" w:eastAsia="pt-BR"/>
         </w:rPr>
-        <w:t xml:space="preserve"> VARCHAR(100)  NOT NULL,</w:t>
+        <w:t xml:space="preserve"> </w:t>
+      </w:r>
+      <w:proofErr w:type="gramStart"/>
+      <w:r>
+        <w:rPr>
+          <w:rFonts w:ascii="Courier New" w:eastAsia="Courier New" w:hAnsi="Courier New" w:cs="Courier New"/>
+          <w:color w:val="000000"/>
+          <w:sz w:val="18"/>
+          <w:szCs w:val="18"/>
+          <w:lang w:val="en-US" w:eastAsia="pt-BR"/>
+        </w:rPr>
+        <w:t>VARCHAR(</w:t>
+      </w:r>
+      <w:proofErr w:type="gramEnd"/>
+      <w:r>
+        <w:rPr>
+          <w:rFonts w:ascii="Courier New" w:eastAsia="Courier New" w:hAnsi="Courier New" w:cs="Courier New"/>
+          <w:color w:val="000000"/>
+          <w:sz w:val="18"/>
+          <w:szCs w:val="18"/>
+          <w:lang w:val="en-US" w:eastAsia="pt-BR"/>
+        </w:rPr>
+        <w:t>100</w:t>
+      </w:r>
+      <w:proofErr w:type="gramStart"/>
+      <w:r>
+        <w:rPr>
+          <w:rFonts w:ascii="Courier New" w:eastAsia="Courier New" w:hAnsi="Courier New" w:cs="Courier New"/>
+          <w:color w:val="000000"/>
+          <w:sz w:val="18"/>
+          <w:szCs w:val="18"/>
+          <w:lang w:val="en-US" w:eastAsia="pt-BR"/>
+        </w:rPr>
+        <w:t>)  NOT</w:t>
+      </w:r>
+      <w:proofErr w:type="gramEnd"/>
+      <w:r>
+        <w:rPr>
+          <w:rFonts w:ascii="Courier New" w:eastAsia="Courier New" w:hAnsi="Courier New" w:cs="Courier New"/>
+          <w:color w:val="000000"/>
+          <w:sz w:val="18"/>
+          <w:szCs w:val="18"/>
+          <w:lang w:val="en-US" w:eastAsia="pt-BR"/>
+        </w:rPr>
+        <w:t xml:space="preserve"> NULL,</w:t>
       </w:r>
     </w:p>
     <w:p>
@@ -19006,7 +19385,29 @@
           <w:szCs w:val="18"/>
           <w:lang w:val="en-US" w:eastAsia="pt-BR"/>
         </w:rPr>
-        <w:t xml:space="preserve">   VARCHAR(255)      NULL,</w:t>
+        <w:t xml:space="preserve">   </w:t>
+      </w:r>
+      <w:proofErr w:type="gramStart"/>
+      <w:r>
+        <w:rPr>
+          <w:rFonts w:ascii="Courier New" w:eastAsia="Courier New" w:hAnsi="Courier New" w:cs="Courier New"/>
+          <w:color w:val="000000"/>
+          <w:sz w:val="18"/>
+          <w:szCs w:val="18"/>
+          <w:lang w:val="en-US" w:eastAsia="pt-BR"/>
+        </w:rPr>
+        <w:t>VARCHAR(</w:t>
+      </w:r>
+      <w:proofErr w:type="gramEnd"/>
+      <w:r>
+        <w:rPr>
+          <w:rFonts w:ascii="Courier New" w:eastAsia="Courier New" w:hAnsi="Courier New" w:cs="Courier New"/>
+          <w:color w:val="000000"/>
+          <w:sz w:val="18"/>
+          <w:szCs w:val="18"/>
+          <w:lang w:val="en-US" w:eastAsia="pt-BR"/>
+        </w:rPr>
+        <w:t>255)      NULL,</w:t>
       </w:r>
     </w:p>
     <w:p>
@@ -19029,6 +19430,7 @@
         <w:t xml:space="preserve">  </w:t>
       </w:r>
       <w:proofErr w:type="spellStart"/>
+      <w:proofErr w:type="gramStart"/>
       <w:r>
         <w:rPr>
           <w:rFonts w:ascii="Courier New" w:eastAsia="Courier New" w:hAnsi="Courier New" w:cs="Courier New"/>
@@ -19048,7 +19450,18 @@
           <w:szCs w:val="18"/>
           <w:lang w:val="en-US" w:eastAsia="pt-BR"/>
         </w:rPr>
-        <w:t xml:space="preserve">  INT               NULL,</w:t>
+        <w:t xml:space="preserve">  INT</w:t>
+      </w:r>
+      <w:proofErr w:type="gramEnd"/>
+      <w:r>
+        <w:rPr>
+          <w:rFonts w:ascii="Courier New" w:eastAsia="Courier New" w:hAnsi="Courier New" w:cs="Courier New"/>
+          <w:color w:val="000000"/>
+          <w:sz w:val="18"/>
+          <w:szCs w:val="18"/>
+          <w:lang w:val="en-US" w:eastAsia="pt-BR"/>
+        </w:rPr>
+        <w:t xml:space="preserve">               NULL,</w:t>
       </w:r>
     </w:p>
     <w:p>
@@ -19090,7 +19503,29 @@
           <w:szCs w:val="18"/>
           <w:lang w:val="en-US" w:eastAsia="pt-BR"/>
         </w:rPr>
-        <w:t xml:space="preserve">       TINYINT(1)    NOT NULL DEFAULT 1,</w:t>
+        <w:t xml:space="preserve">       </w:t>
+      </w:r>
+      <w:proofErr w:type="gramStart"/>
+      <w:r>
+        <w:rPr>
+          <w:rFonts w:ascii="Courier New" w:eastAsia="Courier New" w:hAnsi="Courier New" w:cs="Courier New"/>
+          <w:color w:val="000000"/>
+          <w:sz w:val="18"/>
+          <w:szCs w:val="18"/>
+          <w:lang w:val="en-US" w:eastAsia="pt-BR"/>
+        </w:rPr>
+        <w:t>TINYINT(</w:t>
+      </w:r>
+      <w:proofErr w:type="gramEnd"/>
+      <w:r>
+        <w:rPr>
+          <w:rFonts w:ascii="Courier New" w:eastAsia="Courier New" w:hAnsi="Courier New" w:cs="Courier New"/>
+          <w:color w:val="000000"/>
+          <w:sz w:val="18"/>
+          <w:szCs w:val="18"/>
+          <w:lang w:val="en-US" w:eastAsia="pt-BR"/>
+        </w:rPr>
+        <w:t>1)    NOT NULL DEFAULT 1,</w:t>
       </w:r>
     </w:p>
     <w:p>
@@ -19372,7 +19807,51 @@
           <w:szCs w:val="18"/>
           <w:lang w:val="es-419" w:eastAsia="pt-BR"/>
         </w:rPr>
-        <w:t xml:space="preserve">           VARCHAR(100)  NOT NULL,</w:t>
+        <w:t xml:space="preserve">           </w:t>
+      </w:r>
+      <w:proofErr w:type="gramStart"/>
+      <w:r>
+        <w:rPr>
+          <w:rFonts w:ascii="Courier New" w:eastAsia="Courier New" w:hAnsi="Courier New" w:cs="Courier New"/>
+          <w:color w:val="000000"/>
+          <w:sz w:val="18"/>
+          <w:szCs w:val="18"/>
+          <w:lang w:val="es-419" w:eastAsia="pt-BR"/>
+        </w:rPr>
+        <w:t>VARCHAR(</w:t>
+      </w:r>
+      <w:proofErr w:type="gramEnd"/>
+      <w:r>
+        <w:rPr>
+          <w:rFonts w:ascii="Courier New" w:eastAsia="Courier New" w:hAnsi="Courier New" w:cs="Courier New"/>
+          <w:color w:val="000000"/>
+          <w:sz w:val="18"/>
+          <w:szCs w:val="18"/>
+          <w:lang w:val="es-419" w:eastAsia="pt-BR"/>
+        </w:rPr>
+        <w:t>100</w:t>
+      </w:r>
+      <w:proofErr w:type="gramStart"/>
+      <w:r>
+        <w:rPr>
+          <w:rFonts w:ascii="Courier New" w:eastAsia="Courier New" w:hAnsi="Courier New" w:cs="Courier New"/>
+          <w:color w:val="000000"/>
+          <w:sz w:val="18"/>
+          <w:szCs w:val="18"/>
+          <w:lang w:val="es-419" w:eastAsia="pt-BR"/>
+        </w:rPr>
+        <w:t>)  NOT</w:t>
+      </w:r>
+      <w:proofErr w:type="gramEnd"/>
+      <w:r>
+        <w:rPr>
+          <w:rFonts w:ascii="Courier New" w:eastAsia="Courier New" w:hAnsi="Courier New" w:cs="Courier New"/>
+          <w:color w:val="000000"/>
+          <w:sz w:val="18"/>
+          <w:szCs w:val="18"/>
+          <w:lang w:val="es-419" w:eastAsia="pt-BR"/>
+        </w:rPr>
+        <w:t xml:space="preserve"> NULL,</w:t>
       </w:r>
     </w:p>
     <w:p>
@@ -19414,7 +19893,29 @@
           <w:szCs w:val="18"/>
           <w:lang w:val="es-419" w:eastAsia="pt-BR"/>
         </w:rPr>
-        <w:t xml:space="preserve">   VARCHAR(100)      NULL,</w:t>
+        <w:t xml:space="preserve">   </w:t>
+      </w:r>
+      <w:proofErr w:type="gramStart"/>
+      <w:r>
+        <w:rPr>
+          <w:rFonts w:ascii="Courier New" w:eastAsia="Courier New" w:hAnsi="Courier New" w:cs="Courier New"/>
+          <w:color w:val="000000"/>
+          <w:sz w:val="18"/>
+          <w:szCs w:val="18"/>
+          <w:lang w:val="es-419" w:eastAsia="pt-BR"/>
+        </w:rPr>
+        <w:t>VARCHAR(</w:t>
+      </w:r>
+      <w:proofErr w:type="gramEnd"/>
+      <w:r>
+        <w:rPr>
+          <w:rFonts w:ascii="Courier New" w:eastAsia="Courier New" w:hAnsi="Courier New" w:cs="Courier New"/>
+          <w:color w:val="000000"/>
+          <w:sz w:val="18"/>
+          <w:szCs w:val="18"/>
+          <w:lang w:val="es-419" w:eastAsia="pt-BR"/>
+        </w:rPr>
+        <w:t>100)      NULL,</w:t>
       </w:r>
     </w:p>
     <w:p>
@@ -19456,7 +19957,29 @@
           <w:szCs w:val="18"/>
           <w:lang w:val="en-US" w:eastAsia="pt-BR"/>
         </w:rPr>
-        <w:t xml:space="preserve">      VARCHAR(255)      NULL,</w:t>
+        <w:t xml:space="preserve">      </w:t>
+      </w:r>
+      <w:proofErr w:type="gramStart"/>
+      <w:r>
+        <w:rPr>
+          <w:rFonts w:ascii="Courier New" w:eastAsia="Courier New" w:hAnsi="Courier New" w:cs="Courier New"/>
+          <w:color w:val="000000"/>
+          <w:sz w:val="18"/>
+          <w:szCs w:val="18"/>
+          <w:lang w:val="en-US" w:eastAsia="pt-BR"/>
+        </w:rPr>
+        <w:t>VARCHAR(</w:t>
+      </w:r>
+      <w:proofErr w:type="gramEnd"/>
+      <w:r>
+        <w:rPr>
+          <w:rFonts w:ascii="Courier New" w:eastAsia="Courier New" w:hAnsi="Courier New" w:cs="Courier New"/>
+          <w:color w:val="000000"/>
+          <w:sz w:val="18"/>
+          <w:szCs w:val="18"/>
+          <w:lang w:val="en-US" w:eastAsia="pt-BR"/>
+        </w:rPr>
+        <w:t>255)      NULL,</w:t>
       </w:r>
     </w:p>
     <w:p>
@@ -19499,7 +20022,29 @@
           <w:szCs w:val="18"/>
           <w:lang w:val="en-US" w:eastAsia="pt-BR"/>
         </w:rPr>
-        <w:t xml:space="preserve">          TINYINT(1)    NOT NULL DEFAULT 1,</w:t>
+        <w:t xml:space="preserve">          </w:t>
+      </w:r>
+      <w:proofErr w:type="gramStart"/>
+      <w:r>
+        <w:rPr>
+          <w:rFonts w:ascii="Courier New" w:eastAsia="Courier New" w:hAnsi="Courier New" w:cs="Courier New"/>
+          <w:color w:val="000000"/>
+          <w:sz w:val="18"/>
+          <w:szCs w:val="18"/>
+          <w:lang w:val="en-US" w:eastAsia="pt-BR"/>
+        </w:rPr>
+        <w:t>TINYINT(</w:t>
+      </w:r>
+      <w:proofErr w:type="gramEnd"/>
+      <w:r>
+        <w:rPr>
+          <w:rFonts w:ascii="Courier New" w:eastAsia="Courier New" w:hAnsi="Courier New" w:cs="Courier New"/>
+          <w:color w:val="000000"/>
+          <w:sz w:val="18"/>
+          <w:szCs w:val="18"/>
+          <w:lang w:val="en-US" w:eastAsia="pt-BR"/>
+        </w:rPr>
+        <w:t>1)    NOT NULL DEFAULT 1,</w:t>
       </w:r>
     </w:p>
     <w:p>
@@ -19941,7 +20486,51 @@
           <w:szCs w:val="18"/>
           <w:lang w:val="en-US" w:eastAsia="pt-BR"/>
         </w:rPr>
-        <w:t xml:space="preserve"> VARCHAR(100)  NOT NULL,</w:t>
+        <w:t xml:space="preserve"> </w:t>
+      </w:r>
+      <w:proofErr w:type="gramStart"/>
+      <w:r>
+        <w:rPr>
+          <w:rFonts w:ascii="Courier New" w:eastAsia="Courier New" w:hAnsi="Courier New" w:cs="Courier New"/>
+          <w:color w:val="000000"/>
+          <w:sz w:val="18"/>
+          <w:szCs w:val="18"/>
+          <w:lang w:val="en-US" w:eastAsia="pt-BR"/>
+        </w:rPr>
+        <w:t>VARCHAR(</w:t>
+      </w:r>
+      <w:proofErr w:type="gramEnd"/>
+      <w:r>
+        <w:rPr>
+          <w:rFonts w:ascii="Courier New" w:eastAsia="Courier New" w:hAnsi="Courier New" w:cs="Courier New"/>
+          <w:color w:val="000000"/>
+          <w:sz w:val="18"/>
+          <w:szCs w:val="18"/>
+          <w:lang w:val="en-US" w:eastAsia="pt-BR"/>
+        </w:rPr>
+        <w:t>100</w:t>
+      </w:r>
+      <w:proofErr w:type="gramStart"/>
+      <w:r>
+        <w:rPr>
+          <w:rFonts w:ascii="Courier New" w:eastAsia="Courier New" w:hAnsi="Courier New" w:cs="Courier New"/>
+          <w:color w:val="000000"/>
+          <w:sz w:val="18"/>
+          <w:szCs w:val="18"/>
+          <w:lang w:val="en-US" w:eastAsia="pt-BR"/>
+        </w:rPr>
+        <w:t>)  NOT</w:t>
+      </w:r>
+      <w:proofErr w:type="gramEnd"/>
+      <w:r>
+        <w:rPr>
+          <w:rFonts w:ascii="Courier New" w:eastAsia="Courier New" w:hAnsi="Courier New" w:cs="Courier New"/>
+          <w:color w:val="000000"/>
+          <w:sz w:val="18"/>
+          <w:szCs w:val="18"/>
+          <w:lang w:val="en-US" w:eastAsia="pt-BR"/>
+        </w:rPr>
+        <w:t xml:space="preserve"> NULL,</w:t>
       </w:r>
     </w:p>
     <w:p>
@@ -19983,7 +20572,29 @@
           <w:szCs w:val="18"/>
           <w:lang w:val="en-US" w:eastAsia="pt-BR"/>
         </w:rPr>
-        <w:t xml:space="preserve">     TINYINT(1)    NOT NULL DEFAULT 1,</w:t>
+        <w:t xml:space="preserve">     </w:t>
+      </w:r>
+      <w:proofErr w:type="gramStart"/>
+      <w:r>
+        <w:rPr>
+          <w:rFonts w:ascii="Courier New" w:eastAsia="Courier New" w:hAnsi="Courier New" w:cs="Courier New"/>
+          <w:color w:val="000000"/>
+          <w:sz w:val="18"/>
+          <w:szCs w:val="18"/>
+          <w:lang w:val="en-US" w:eastAsia="pt-BR"/>
+        </w:rPr>
+        <w:t>TINYINT(</w:t>
+      </w:r>
+      <w:proofErr w:type="gramEnd"/>
+      <w:r>
+        <w:rPr>
+          <w:rFonts w:ascii="Courier New" w:eastAsia="Courier New" w:hAnsi="Courier New" w:cs="Courier New"/>
+          <w:color w:val="000000"/>
+          <w:sz w:val="18"/>
+          <w:szCs w:val="18"/>
+          <w:lang w:val="en-US" w:eastAsia="pt-BR"/>
+        </w:rPr>
+        <w:t>1)    NOT NULL DEFAULT 1,</w:t>
       </w:r>
     </w:p>
     <w:p>
@@ -20493,7 +21104,29 @@
           <w:szCs w:val="18"/>
           <w:lang w:eastAsia="pt-BR"/>
         </w:rPr>
-        <w:t xml:space="preserve">  status           ENUM('</w:t>
+        <w:t xml:space="preserve">  status           </w:t>
+      </w:r>
+      <w:proofErr w:type="gramStart"/>
+      <w:r>
+        <w:rPr>
+          <w:rFonts w:ascii="Courier New" w:eastAsia="Courier New" w:hAnsi="Courier New" w:cs="Courier New"/>
+          <w:color w:val="000000"/>
+          <w:sz w:val="18"/>
+          <w:szCs w:val="18"/>
+          <w:lang w:eastAsia="pt-BR"/>
+        </w:rPr>
+        <w:t>ENUM(</w:t>
+      </w:r>
+      <w:proofErr w:type="gramEnd"/>
+      <w:r>
+        <w:rPr>
+          <w:rFonts w:ascii="Courier New" w:eastAsia="Courier New" w:hAnsi="Courier New" w:cs="Courier New"/>
+          <w:color w:val="000000"/>
+          <w:sz w:val="18"/>
+          <w:szCs w:val="18"/>
+          <w:lang w:eastAsia="pt-BR"/>
+        </w:rPr>
+        <w:t>'</w:t>
       </w:r>
       <w:proofErr w:type="spellStart"/>
       <w:r>
@@ -20820,7 +21453,18 @@
           <w:szCs w:val="18"/>
           <w:lang w:val="en-US" w:eastAsia="pt-BR"/>
         </w:rPr>
-        <w:t>id_professor</w:t>
+        <w:t>id_</w:t>
+      </w:r>
+      <w:proofErr w:type="gramStart"/>
+      <w:r>
+        <w:rPr>
+          <w:rFonts w:ascii="Courier New" w:eastAsia="Courier New" w:hAnsi="Courier New" w:cs="Courier New"/>
+          <w:color w:val="000000"/>
+          <w:sz w:val="18"/>
+          <w:szCs w:val="18"/>
+          <w:lang w:val="en-US" w:eastAsia="pt-BR"/>
+        </w:rPr>
+        <w:t>professor</w:t>
       </w:r>
       <w:proofErr w:type="spellEnd"/>
       <w:r>
@@ -20831,7 +21475,18 @@
           <w:szCs w:val="18"/>
           <w:lang w:val="en-US" w:eastAsia="pt-BR"/>
         </w:rPr>
-        <w:t xml:space="preserve">)     REFERENCES </w:t>
+        <w:t xml:space="preserve">)   </w:t>
+      </w:r>
+      <w:proofErr w:type="gramEnd"/>
+      <w:r>
+        <w:rPr>
+          <w:rFonts w:ascii="Courier New" w:eastAsia="Courier New" w:hAnsi="Courier New" w:cs="Courier New"/>
+          <w:color w:val="000000"/>
+          <w:sz w:val="18"/>
+          <w:szCs w:val="18"/>
+          <w:lang w:val="en-US" w:eastAsia="pt-BR"/>
+        </w:rPr>
+        <w:t xml:space="preserve">  REFERENCES </w:t>
       </w:r>
       <w:proofErr w:type="spellStart"/>
       <w:r>
@@ -20936,7 +21591,18 @@
           <w:szCs w:val="18"/>
           <w:lang w:val="en-US" w:eastAsia="pt-BR"/>
         </w:rPr>
-        <w:t>id_tecnico</w:t>
+        <w:t>id_</w:t>
+      </w:r>
+      <w:proofErr w:type="gramStart"/>
+      <w:r>
+        <w:rPr>
+          <w:rFonts w:ascii="Courier New" w:eastAsia="Courier New" w:hAnsi="Courier New" w:cs="Courier New"/>
+          <w:color w:val="000000"/>
+          <w:sz w:val="18"/>
+          <w:szCs w:val="18"/>
+          <w:lang w:val="en-US" w:eastAsia="pt-BR"/>
+        </w:rPr>
+        <w:t>tecnico</w:t>
       </w:r>
       <w:proofErr w:type="spellEnd"/>
       <w:r>
@@ -20947,7 +21613,18 @@
           <w:szCs w:val="18"/>
           <w:lang w:val="en-US" w:eastAsia="pt-BR"/>
         </w:rPr>
-        <w:t xml:space="preserve">)       REFERENCES </w:t>
+        <w:t xml:space="preserve">)   </w:t>
+      </w:r>
+      <w:proofErr w:type="gramEnd"/>
+      <w:r>
+        <w:rPr>
+          <w:rFonts w:ascii="Courier New" w:eastAsia="Courier New" w:hAnsi="Courier New" w:cs="Courier New"/>
+          <w:color w:val="000000"/>
+          <w:sz w:val="18"/>
+          <w:szCs w:val="18"/>
+          <w:lang w:val="en-US" w:eastAsia="pt-BR"/>
+        </w:rPr>
+        <w:t xml:space="preserve">    REFERENCES </w:t>
       </w:r>
       <w:proofErr w:type="spellStart"/>
       <w:r>
@@ -21052,7 +21729,18 @@
           <w:szCs w:val="18"/>
           <w:lang w:val="en-US" w:eastAsia="pt-BR"/>
         </w:rPr>
-        <w:t>id_laboratorio</w:t>
+        <w:t>id_</w:t>
+      </w:r>
+      <w:proofErr w:type="gramStart"/>
+      <w:r>
+        <w:rPr>
+          <w:rFonts w:ascii="Courier New" w:eastAsia="Courier New" w:hAnsi="Courier New" w:cs="Courier New"/>
+          <w:color w:val="000000"/>
+          <w:sz w:val="18"/>
+          <w:szCs w:val="18"/>
+          <w:lang w:val="en-US" w:eastAsia="pt-BR"/>
+        </w:rPr>
+        <w:t>laboratorio</w:t>
       </w:r>
       <w:proofErr w:type="spellEnd"/>
       <w:r>
@@ -21063,7 +21751,18 @@
           <w:szCs w:val="18"/>
           <w:lang w:val="en-US" w:eastAsia="pt-BR"/>
         </w:rPr>
-        <w:t xml:space="preserve">)   REFERENCES </w:t>
+        <w:t xml:space="preserve">)   </w:t>
+      </w:r>
+      <w:proofErr w:type="gramEnd"/>
+      <w:r>
+        <w:rPr>
+          <w:rFonts w:ascii="Courier New" w:eastAsia="Courier New" w:hAnsi="Courier New" w:cs="Courier New"/>
+          <w:color w:val="000000"/>
+          <w:sz w:val="18"/>
+          <w:szCs w:val="18"/>
+          <w:lang w:val="en-US" w:eastAsia="pt-BR"/>
+        </w:rPr>
+        <w:t xml:space="preserve">REFERENCES </w:t>
       </w:r>
       <w:proofErr w:type="spellStart"/>
       <w:r>
@@ -21168,7 +21867,18 @@
           <w:szCs w:val="18"/>
           <w:lang w:val="en-US" w:eastAsia="pt-BR"/>
         </w:rPr>
-        <w:t>id_equipamento</w:t>
+        <w:t>id_</w:t>
+      </w:r>
+      <w:proofErr w:type="gramStart"/>
+      <w:r>
+        <w:rPr>
+          <w:rFonts w:ascii="Courier New" w:eastAsia="Courier New" w:hAnsi="Courier New" w:cs="Courier New"/>
+          <w:color w:val="000000"/>
+          <w:sz w:val="18"/>
+          <w:szCs w:val="18"/>
+          <w:lang w:val="en-US" w:eastAsia="pt-BR"/>
+        </w:rPr>
+        <w:t>equipamento</w:t>
       </w:r>
       <w:proofErr w:type="spellEnd"/>
       <w:r>
@@ -21179,7 +21889,18 @@
           <w:szCs w:val="18"/>
           <w:lang w:val="en-US" w:eastAsia="pt-BR"/>
         </w:rPr>
-        <w:t xml:space="preserve">)   REFERENCES </w:t>
+        <w:t xml:space="preserve">)   </w:t>
+      </w:r>
+      <w:proofErr w:type="gramEnd"/>
+      <w:r>
+        <w:rPr>
+          <w:rFonts w:ascii="Courier New" w:eastAsia="Courier New" w:hAnsi="Courier New" w:cs="Courier New"/>
+          <w:color w:val="000000"/>
+          <w:sz w:val="18"/>
+          <w:szCs w:val="18"/>
+          <w:lang w:val="en-US" w:eastAsia="pt-BR"/>
+        </w:rPr>
+        <w:t xml:space="preserve">REFERENCES </w:t>
       </w:r>
       <w:proofErr w:type="spellStart"/>
       <w:r>
@@ -21431,6 +22152,7 @@
           <w:lang w:eastAsia="pt-BR"/>
         </w:rPr>
       </w:pPr>
+      <w:proofErr w:type="gramStart"/>
       <w:r>
         <w:rPr>
           <w:rFonts w:ascii="Courier New" w:eastAsia="Courier New" w:hAnsi="Courier New" w:cs="Courier New"/>
@@ -21439,7 +22161,18 @@
           <w:szCs w:val="18"/>
           <w:lang w:eastAsia="pt-BR"/>
         </w:rPr>
-        <w:t>--  Dados iniciais (</w:t>
+        <w:t>--  Dados</w:t>
+      </w:r>
+      <w:proofErr w:type="gramEnd"/>
+      <w:r>
+        <w:rPr>
+          <w:rFonts w:ascii="Courier New" w:eastAsia="Courier New" w:hAnsi="Courier New" w:cs="Courier New"/>
+          <w:color w:val="007700"/>
+          <w:sz w:val="18"/>
+          <w:szCs w:val="18"/>
+          <w:lang w:eastAsia="pt-BR"/>
+        </w:rPr>
+        <w:t xml:space="preserve"> iniciais (</w:t>
       </w:r>
       <w:proofErr w:type="spellStart"/>
       <w:r>
@@ -22236,6 +22969,7 @@
         <w:t xml:space="preserve">├── </w:t>
       </w:r>
       <w:proofErr w:type="spellStart"/>
+      <w:proofErr w:type="gramStart"/>
       <w:r>
         <w:rPr>
           <w:rFonts w:cs="Times New Roman"/>
@@ -22243,6 +22977,7 @@
         <w:t>composer.json</w:t>
       </w:r>
       <w:proofErr w:type="spellEnd"/>
+      <w:proofErr w:type="gramEnd"/>
     </w:p>
     <w:p>
       <w:pPr>
@@ -22257,6 +22992,7 @@
         <w:t xml:space="preserve">├── </w:t>
       </w:r>
       <w:proofErr w:type="spellStart"/>
+      <w:proofErr w:type="gramStart"/>
       <w:r>
         <w:rPr>
           <w:rFonts w:cs="Times New Roman"/>
@@ -22264,6 +23000,7 @@
         <w:t>composer.lock</w:t>
       </w:r>
       <w:proofErr w:type="spellEnd"/>
+      <w:proofErr w:type="gramEnd"/>
     </w:p>
     <w:p>
       <w:pPr>
@@ -22510,6 +23247,7 @@
         <w:t xml:space="preserve">│   │   ├── </w:t>
       </w:r>
       <w:proofErr w:type="spellStart"/>
+      <w:proofErr w:type="gramStart"/>
       <w:r>
         <w:rPr>
           <w:rFonts w:cs="Times New Roman"/>
@@ -22521,7 +23259,14 @@
         <w:rPr>
           <w:rFonts w:cs="Times New Roman"/>
         </w:rPr>
-        <w:t xml:space="preserve">  # UC04-UC07</w:t>
+        <w:t xml:space="preserve">  #</w:t>
+      </w:r>
+      <w:proofErr w:type="gramEnd"/>
+      <w:r>
+        <w:rPr>
+          <w:rFonts w:cs="Times New Roman"/>
+        </w:rPr>
+        <w:t xml:space="preserve"> UC04-UC07</w:t>
       </w:r>
     </w:p>
     <w:p>
@@ -22537,6 +23282,7 @@
         <w:t xml:space="preserve">│   │   ├── </w:t>
       </w:r>
       <w:proofErr w:type="spellStart"/>
+      <w:proofErr w:type="gramStart"/>
       <w:r>
         <w:rPr>
           <w:rFonts w:cs="Times New Roman"/>
@@ -22548,7 +23294,14 @@
         <w:rPr>
           <w:rFonts w:cs="Times New Roman"/>
         </w:rPr>
-        <w:t xml:space="preserve">  # UC08</w:t>
+        <w:t xml:space="preserve">  #</w:t>
+      </w:r>
+      <w:proofErr w:type="gramEnd"/>
+      <w:r>
+        <w:rPr>
+          <w:rFonts w:cs="Times New Roman"/>
+        </w:rPr>
+        <w:t xml:space="preserve"> UC08</w:t>
       </w:r>
     </w:p>
     <w:p>
@@ -22564,6 +23317,7 @@
         <w:t xml:space="preserve">│   │   ├── </w:t>
       </w:r>
       <w:proofErr w:type="spellStart"/>
+      <w:proofErr w:type="gramStart"/>
       <w:r>
         <w:rPr>
           <w:rFonts w:cs="Times New Roman"/>
@@ -22575,7 +23329,14 @@
         <w:rPr>
           <w:rFonts w:cs="Times New Roman"/>
         </w:rPr>
-        <w:t xml:space="preserve">  # UC09</w:t>
+        <w:t xml:space="preserve">  #</w:t>
+      </w:r>
+      <w:proofErr w:type="gramEnd"/>
+      <w:r>
+        <w:rPr>
+          <w:rFonts w:cs="Times New Roman"/>
+        </w:rPr>
+        <w:t xml:space="preserve"> UC09</w:t>
       </w:r>
     </w:p>
     <w:p>
@@ -23872,6 +24633,7 @@
         <w:t xml:space="preserve"> </w:t>
       </w:r>
       <w:proofErr w:type="spellStart"/>
+      <w:proofErr w:type="gramStart"/>
       <w:r>
         <w:rPr>
           <w:rFonts w:cs="Times New Roman"/>
@@ -23883,7 +24645,14 @@
         <w:rPr>
           <w:rFonts w:cs="Times New Roman"/>
         </w:rPr>
-        <w:t xml:space="preserve"> ?-&gt; (PHP 8.0+): utilizado para encadeamento seguro em objetos </w:t>
+        <w:t xml:space="preserve"> ?</w:t>
+      </w:r>
+      <w:proofErr w:type="gramEnd"/>
+      <w:r>
+        <w:rPr>
+          <w:rFonts w:cs="Times New Roman"/>
+        </w:rPr>
+        <w:t xml:space="preserve">-&gt; (PHP 8.0+): utilizado para encadeamento seguro em objetos </w:t>
       </w:r>
       <w:proofErr w:type="spellStart"/>
       <w:r>

</xml_diff>